<commit_message>
Modified dpi_ls to use lakera for detecting risk
</commit_message>
<xml_diff>
--- a/resourceDocuments/Execution_Detection_Resources.docx
+++ b/resourceDocuments/Execution_Detection_Resources.docx
@@ -637,6 +637,23 @@
         <w:t>Option 1: Arize Phoenix</w:t>
       </w:r>
       <w:bookmarkEnd w:id="1001"/>
+    </w:p>
+    <w:p>
+      <w:r>
+        <w:rPr>
+          <w:b/>
+        </w:rPr>
+        <w:t xml:space="preserve">Official Website: </w:t>
+      </w:r>
+      <w:hyperlink r:id="rId9">
+        <w:r>
+          <w:rPr>
+            <w:color w:val="0563C1"/>
+            <w:u w:val="single"/>
+          </w:rPr>
+          <w:t>https://phoenix.arize.com</w:t>
+        </w:r>
+      </w:hyperlink>
     </w:p>
     <w:p>
       <w:bookmarkStart w:id="1002" w:name="_Toc1002"/>
@@ -1315,6 +1332,23 @@
       <w:bookmarkEnd w:id="1014"/>
     </w:p>
     <w:p>
+      <w:r>
+        <w:rPr>
+          <w:b/>
+        </w:rPr>
+        <w:t xml:space="preserve">Official Website: </w:t>
+      </w:r>
+      <w:hyperlink r:id="rId10">
+        <w:r>
+          <w:rPr>
+            <w:color w:val="0563C1"/>
+            <w:u w:val="single"/>
+          </w:rPr>
+          <w:t>https://www.traceloop.com</w:t>
+        </w:r>
+      </w:hyperlink>
+    </w:p>
+    <w:p>
       <w:bookmarkStart w:id="1015" w:name="_Toc1015"/>
       <w:pPr>
         <w:pStyle w:val="Heading2"/>
@@ -1901,6 +1935,23 @@
         <w:t>Option 3: Langfuse</w:t>
       </w:r>
       <w:bookmarkEnd w:id="1027"/>
+    </w:p>
+    <w:p>
+      <w:r>
+        <w:rPr>
+          <w:b/>
+        </w:rPr>
+        <w:t xml:space="preserve">Official Website: </w:t>
+      </w:r>
+      <w:hyperlink r:id="rId11">
+        <w:r>
+          <w:rPr>
+            <w:color w:val="0563C1"/>
+            <w:u w:val="single"/>
+          </w:rPr>
+          <w:t>https://langfuse.com</w:t>
+        </w:r>
+      </w:hyperlink>
     </w:p>
     <w:p>
       <w:bookmarkStart w:id="1028" w:name="_Toc1028"/>

</xml_diff>